<commit_message>
DOCS: retirar afirmaciones obsoletas sobre la consola y la purga
</commit_message>
<xml_diff>
--- a/docs/Entregable 29-8-26/BayStream_Incremento1_Seguridad_Calidad.docx
+++ b/docs/Entregable 29-8-26/BayStream_Incremento1_Seguridad_Calidad.docx
@@ -5950,7 +5950,7 @@
           <w:color w:val="000000"/>
           <w:sz w:val="24"/>
         </w:rPr>
-        <w:t>Actividades de seguridad diferidas a la tarea de cierre TC-03</w:t>
+        <w:t>Actividades de seguridad diferidas a la tarea de cierre TC‑03</w:t>
       </w:r>
     </w:p>
     <w:tbl>
@@ -6084,53 +6084,6 @@
                 <w:b w:val="0"/>
                 <w:sz w:val="20"/>
               </w:rPr>
-              <w:t>Verificación del estado real de las reglas en la consola de Firebase</w:t>
-            </w:r>
-          </w:p>
-        </w:tc>
-        <w:tc>
-          <w:tcPr>
-            <w:tcW w:type="dxa" w:w="4254"/>
-          </w:tcPr>
-          <w:p>
-            <w:pPr>
-              <w:spacing w:after="40" w:line="240" w:lineRule="auto"/>
-              <w:ind w:firstLine="0"/>
-              <w:jc w:val="left"/>
-            </w:pPr>
-            <w:r/>
-            <w:r>
-              <w:rPr>
-                <w:rFonts w:ascii="Arial" w:hAnsi="Arial"/>
-                <w:b w:val="0"/>
-                <w:sz w:val="20"/>
-              </w:rPr>
-              <w:t>El hallazgo H‑03 se infiere del comportamiento por defecto de la plataforma, no de una observación directa.</w:t>
-            </w:r>
-          </w:p>
-        </w:tc>
-      </w:tr>
-      <w:tr>
-        <w:trPr>
-          <w:cantSplit w:val="true"/>
-        </w:trPr>
-        <w:tc>
-          <w:tcPr>
-            <w:tcW w:type="dxa" w:w="3627"/>
-          </w:tcPr>
-          <w:p>
-            <w:pPr>
-              <w:spacing w:after="40" w:line="240" w:lineRule="auto"/>
-              <w:ind w:firstLine="0"/>
-              <w:jc w:val="left"/>
-            </w:pPr>
-            <w:r/>
-            <w:r>
-              <w:rPr>
-                <w:rFonts w:ascii="Arial" w:hAnsi="Arial"/>
-                <w:b w:val="0"/>
-                <w:sz w:val="20"/>
-              </w:rPr>
               <w:t>Auditoría del binario Android para protecciones de empaquetado (M7)</w:t>
             </w:r>
           </w:p>
@@ -6225,7 +6178,7 @@
           <w:i w:val="0"/>
           <w:sz w:val="20"/>
         </w:rPr>
-        <w:t xml:space="preserve"> elaboración propia. Las cuatro actividades constituyen el alcance de la tarea TC‑03, calendarizada del 18 al 24 de octubre de 2026.</w:t>
+        <w:t xml:space="preserve"> elaboración propia. Las tres actividades constituyen el alcance de la tarea TC‑03, calendarizada del 18 al 24 de octubre de 2026.</w:t>
       </w:r>
     </w:p>
     <w:p>
@@ -6800,7 +6753,7 @@
           <w:i w:val="0"/>
           <w:sz w:val="24"/>
         </w:rPr>
-        <w:t>Durante la activación del receptor se registraron tres denegaciones de permiso sobre documentos de corridas anteriores que habían quedado sin cerrar. No afectaron a los eventos nuevos. La explicación más probable es que la regla rechazara un segundo cierre sobre documentos ya cerrados —esto es, la garantía de no reabrir una medición operando por sí misma—, si bien no se conservó traza suficiente para descartar que se trate de documentos con una estructura que la regla no contempla. Como medida preventiva se recomienda depurar los documentos pendientes antes de ejecutar una serie de medición completa.</w:t>
+        <w:t>Durante la activación del receptor se registraron tres denegaciones de permiso sobre documentos de corridas anteriores que habían quedado sin cerrar. No afectaron a los eventos nuevos. La explicación más probable es que la regla rechazara un segundo cierre sobre documentos ya cerrados —esto es, la garantía de no reabrir una medición operando por sí misma—, si bien no se conservó traza suficiente para descartar que se trate de documentos con una estructura que la regla no contempla. La colección se revisó posteriormente desde la consola y no quedaba ningún documento sin cerrar.</w:t>
       </w:r>
     </w:p>
     <w:p>

</xml_diff>